<commit_message>
Test plan for Reservation form, and add IDE files to ignore
</commit_message>
<xml_diff>
--- a/tests/GoldTeam_TestPlan_Reservation.docx
+++ b/tests/GoldTeam_TestPlan_Reservation.docx
@@ -330,29 +330,7 @@
                 <w:szCs w:val="20"/>
                 <w:lang w:val="en-US" w:eastAsia="en-US" w:bidi="ar-SA"/>
               </w:rPr>
-              <w:t>2026/0</w:t>
-            </w:r>
-            <w:r>
-              <w:rPr>
-                <w:rFonts w:eastAsia="Calibri" w:cs="Arial" w:ascii="Arial" w:hAnsi="Arial"/>
-                <w:color w:val="C9211E"/>
-                <w:kern w:val="0"/>
-                <w:sz w:val="20"/>
-                <w:szCs w:val="20"/>
-                <w:lang w:val="en-US" w:eastAsia="en-US" w:bidi="ar-SA"/>
-              </w:rPr>
-              <w:t>9</w:t>
-            </w:r>
-            <w:r>
-              <w:rPr>
-                <w:rFonts w:eastAsia="Calibri" w:cs="Arial" w:ascii="Arial" w:hAnsi="Arial"/>
-                <w:color w:val="C9211E"/>
-                <w:kern w:val="0"/>
-                <w:sz w:val="20"/>
-                <w:szCs w:val="20"/>
-                <w:lang w:val="en-US" w:eastAsia="en-US" w:bidi="ar-SA"/>
-              </w:rPr>
-              <w:t>/13</w:t>
+              <w:t>2026/09/13</w:t>
             </w:r>
           </w:p>
         </w:tc>
@@ -1241,13 +1219,13 @@
             <w:r>
               <w:rPr>
                 <w:rFonts w:eastAsia="Calibri" w:cs="Arial" w:ascii="Arial" w:hAnsi="Arial"/>
-                <w:color w:val="C00000"/>
-                <w:kern w:val="0"/>
-                <w:sz w:val="20"/>
-                <w:szCs w:val="20"/>
-                <w:lang w:val="en-US" w:eastAsia="en-US" w:bidi="ar-SA"/>
-              </w:rPr>
-              <w:t>&lt;yyyy/mm/dd&gt;</w:t>
+                <w:color w:val="55308D"/>
+                <w:kern w:val="0"/>
+                <w:sz w:val="20"/>
+                <w:szCs w:val="20"/>
+                <w:lang w:val="en-US" w:eastAsia="en-US" w:bidi="ar-SA"/>
+              </w:rPr>
+              <w:t>2026/09/13</w:t>
             </w:r>
           </w:p>
         </w:tc>
@@ -1323,7 +1301,7 @@
             <w:r>
               <w:rPr>
                 <w:rFonts w:eastAsia="Calibri" w:cs="Arial" w:ascii="Arial" w:hAnsi="Arial"/>
-                <w:color w:val="C00000"/>
+                <w:color w:val="1E6A39"/>
                 <w:kern w:val="0"/>
                 <w:sz w:val="20"/>
                 <w:szCs w:val="20"/>
@@ -1648,22 +1626,19 @@
               <w:spacing w:lineRule="auto" w:line="240" w:before="80" w:after="80"/>
               <w:jc w:val="left"/>
               <w:rPr>
-                <w:rFonts w:ascii="Arial" w:hAnsi="Arial" w:cs="Arial"/>
-                <w:color w:val="C00000"/>
-                <w:sz w:val="20"/>
-                <w:szCs w:val="20"/>
-              </w:rPr>
-            </w:pPr>
-            <w:r>
-              <w:rPr>
-                <w:rFonts w:eastAsia="Calibri" w:cs="Arial" w:ascii="Arial" w:hAnsi="Arial"/>
-                <w:color w:val="C00000"/>
-                <w:kern w:val="0"/>
-                <w:sz w:val="20"/>
-                <w:szCs w:val="20"/>
-                <w:lang w:val="en-US" w:eastAsia="en-US" w:bidi="ar-SA"/>
-              </w:rPr>
-              <w:t>&lt;yes/no&gt;</w:t>
+                <w:color w:val="55308D"/>
+              </w:rPr>
+            </w:pPr>
+            <w:r>
+              <w:rPr>
+                <w:rFonts w:eastAsia="Calibri" w:cs="Arial" w:ascii="Arial" w:hAnsi="Arial"/>
+                <w:color w:val="55308D"/>
+                <w:kern w:val="0"/>
+                <w:sz w:val="20"/>
+                <w:szCs w:val="20"/>
+                <w:lang w:val="en-US" w:eastAsia="en-US" w:bidi="ar-SA"/>
+              </w:rPr>
+              <w:t>yes</w:t>
             </w:r>
           </w:p>
         </w:tc>
@@ -1680,16 +1655,13 @@
               <w:spacing w:lineRule="auto" w:line="240" w:before="80" w:after="80"/>
               <w:jc w:val="left"/>
               <w:rPr>
-                <w:rFonts w:ascii="Arial" w:hAnsi="Arial" w:cs="Arial"/>
-                <w:color w:val="C00000"/>
-                <w:sz w:val="20"/>
-                <w:szCs w:val="20"/>
-              </w:rPr>
-            </w:pPr>
-            <w:r>
-              <w:rPr>
-                <w:rFonts w:eastAsia="Calibri" w:cs="Arial" w:ascii="Arial" w:hAnsi="Arial"/>
-                <w:color w:val="C00000"/>
+                <w:color w:val="1E6A39"/>
+              </w:rPr>
+            </w:pPr>
+            <w:r>
+              <w:rPr>
+                <w:rFonts w:eastAsia="Calibri" w:cs="Arial" w:ascii="Arial" w:hAnsi="Arial"/>
+                <w:color w:val="1E6A39"/>
                 <w:kern w:val="0"/>
                 <w:sz w:val="20"/>
                 <w:szCs w:val="20"/>
@@ -1811,22 +1783,19 @@
               <w:spacing w:lineRule="auto" w:line="240" w:before="80" w:after="80"/>
               <w:jc w:val="left"/>
               <w:rPr>
-                <w:rFonts w:ascii="Arial" w:hAnsi="Arial" w:cs="Arial"/>
-                <w:color w:val="C00000"/>
-                <w:sz w:val="20"/>
-                <w:szCs w:val="20"/>
-              </w:rPr>
-            </w:pPr>
-            <w:r>
-              <w:rPr>
-                <w:rFonts w:eastAsia="Calibri" w:cs="Arial" w:ascii="Arial" w:hAnsi="Arial"/>
-                <w:color w:val="C00000"/>
-                <w:kern w:val="0"/>
-                <w:sz w:val="20"/>
-                <w:szCs w:val="20"/>
-                <w:lang w:val="en-US" w:eastAsia="en-US" w:bidi="ar-SA"/>
-              </w:rPr>
-              <w:t>&lt;yes/no&gt;</w:t>
+                <w:color w:val="55308D"/>
+              </w:rPr>
+            </w:pPr>
+            <w:r>
+              <w:rPr>
+                <w:rFonts w:eastAsia="Calibri" w:cs="Arial" w:ascii="Arial" w:hAnsi="Arial"/>
+                <w:color w:val="55308D"/>
+                <w:kern w:val="0"/>
+                <w:sz w:val="20"/>
+                <w:szCs w:val="20"/>
+                <w:lang w:val="en-US" w:eastAsia="en-US" w:bidi="ar-SA"/>
+              </w:rPr>
+              <w:t>yes</w:t>
             </w:r>
           </w:p>
         </w:tc>
@@ -1843,16 +1812,13 @@
               <w:spacing w:lineRule="auto" w:line="240" w:before="80" w:after="80"/>
               <w:jc w:val="left"/>
               <w:rPr>
-                <w:rFonts w:ascii="Arial" w:hAnsi="Arial" w:cs="Arial"/>
-                <w:color w:val="C00000"/>
-                <w:sz w:val="20"/>
-                <w:szCs w:val="20"/>
-              </w:rPr>
-            </w:pPr>
-            <w:r>
-              <w:rPr>
-                <w:rFonts w:eastAsia="Calibri" w:cs="Arial" w:ascii="Arial" w:hAnsi="Arial"/>
-                <w:color w:val="C00000"/>
+                <w:color w:val="1E6A39"/>
+              </w:rPr>
+            </w:pPr>
+            <w:r>
+              <w:rPr>
+                <w:rFonts w:eastAsia="Calibri" w:cs="Arial" w:ascii="Arial" w:hAnsi="Arial"/>
+                <w:color w:val="1E6A39"/>
                 <w:kern w:val="0"/>
                 <w:sz w:val="20"/>
                 <w:szCs w:val="20"/>
@@ -1974,22 +1940,19 @@
               <w:spacing w:lineRule="auto" w:line="240" w:before="80" w:after="80"/>
               <w:jc w:val="left"/>
               <w:rPr>
-                <w:rFonts w:ascii="Arial" w:hAnsi="Arial" w:cs="Arial"/>
-                <w:color w:val="C00000"/>
-                <w:sz w:val="20"/>
-                <w:szCs w:val="20"/>
-              </w:rPr>
-            </w:pPr>
-            <w:r>
-              <w:rPr>
-                <w:rFonts w:eastAsia="Calibri" w:cs="Arial" w:ascii="Arial" w:hAnsi="Arial"/>
-                <w:color w:val="C00000"/>
-                <w:kern w:val="0"/>
-                <w:sz w:val="20"/>
-                <w:szCs w:val="20"/>
-                <w:lang w:val="en-US" w:eastAsia="en-US" w:bidi="ar-SA"/>
-              </w:rPr>
-              <w:t>&lt;yes/no&gt;</w:t>
+                <w:color w:val="55308D"/>
+              </w:rPr>
+            </w:pPr>
+            <w:r>
+              <w:rPr>
+                <w:rFonts w:eastAsia="Calibri" w:cs="Arial" w:ascii="Arial" w:hAnsi="Arial"/>
+                <w:color w:val="55308D"/>
+                <w:kern w:val="0"/>
+                <w:sz w:val="20"/>
+                <w:szCs w:val="20"/>
+                <w:lang w:val="en-US" w:eastAsia="en-US" w:bidi="ar-SA"/>
+              </w:rPr>
+              <w:t>yes</w:t>
             </w:r>
           </w:p>
         </w:tc>
@@ -2006,16 +1969,13 @@
               <w:spacing w:lineRule="auto" w:line="240" w:before="80" w:after="80"/>
               <w:jc w:val="left"/>
               <w:rPr>
-                <w:rFonts w:ascii="Arial" w:hAnsi="Arial" w:cs="Arial"/>
-                <w:color w:val="C00000"/>
-                <w:sz w:val="20"/>
-                <w:szCs w:val="20"/>
-              </w:rPr>
-            </w:pPr>
-            <w:r>
-              <w:rPr>
-                <w:rFonts w:eastAsia="Calibri" w:cs="Arial" w:ascii="Arial" w:hAnsi="Arial"/>
-                <w:color w:val="C00000"/>
+                <w:color w:val="1E6A39"/>
+              </w:rPr>
+            </w:pPr>
+            <w:r>
+              <w:rPr>
+                <w:rFonts w:eastAsia="Calibri" w:cs="Arial" w:ascii="Arial" w:hAnsi="Arial"/>
+                <w:color w:val="1E6A39"/>
                 <w:kern w:val="0"/>
                 <w:sz w:val="20"/>
                 <w:szCs w:val="20"/>
@@ -2137,22 +2097,19 @@
               <w:spacing w:lineRule="auto" w:line="240" w:before="80" w:after="80"/>
               <w:jc w:val="left"/>
               <w:rPr>
-                <w:rFonts w:ascii="Arial" w:hAnsi="Arial" w:cs="Arial"/>
-                <w:color w:val="C00000"/>
-                <w:sz w:val="20"/>
-                <w:szCs w:val="20"/>
-              </w:rPr>
-            </w:pPr>
-            <w:r>
-              <w:rPr>
-                <w:rFonts w:eastAsia="Calibri" w:cs="Arial" w:ascii="Arial" w:hAnsi="Arial"/>
-                <w:color w:val="C00000"/>
-                <w:kern w:val="0"/>
-                <w:sz w:val="20"/>
-                <w:szCs w:val="20"/>
-                <w:lang w:val="en-US" w:eastAsia="en-US" w:bidi="ar-SA"/>
-              </w:rPr>
-              <w:t>&lt;yes/no&gt;</w:t>
+                <w:color w:val="55308D"/>
+              </w:rPr>
+            </w:pPr>
+            <w:r>
+              <w:rPr>
+                <w:rFonts w:eastAsia="Calibri" w:cs="Arial" w:ascii="Arial" w:hAnsi="Arial"/>
+                <w:color w:val="55308D"/>
+                <w:kern w:val="0"/>
+                <w:sz w:val="20"/>
+                <w:szCs w:val="20"/>
+                <w:lang w:val="en-US" w:eastAsia="en-US" w:bidi="ar-SA"/>
+              </w:rPr>
+              <w:t>yes</w:t>
             </w:r>
           </w:p>
         </w:tc>
@@ -2169,16 +2126,13 @@
               <w:spacing w:lineRule="auto" w:line="240" w:before="80" w:after="80"/>
               <w:jc w:val="left"/>
               <w:rPr>
-                <w:rFonts w:ascii="Arial" w:hAnsi="Arial" w:cs="Arial"/>
-                <w:color w:val="C00000"/>
-                <w:sz w:val="20"/>
-                <w:szCs w:val="20"/>
-              </w:rPr>
-            </w:pPr>
-            <w:r>
-              <w:rPr>
-                <w:rFonts w:eastAsia="Calibri" w:cs="Arial" w:ascii="Arial" w:hAnsi="Arial"/>
-                <w:color w:val="C00000"/>
+                <w:color w:val="1E6A39"/>
+              </w:rPr>
+            </w:pPr>
+            <w:r>
+              <w:rPr>
+                <w:rFonts w:eastAsia="Calibri" w:cs="Arial" w:ascii="Arial" w:hAnsi="Arial"/>
+                <w:color w:val="1E6A39"/>
                 <w:kern w:val="0"/>
                 <w:sz w:val="20"/>
                 <w:szCs w:val="20"/>
@@ -2300,22 +2254,19 @@
               <w:spacing w:lineRule="auto" w:line="240" w:before="80" w:after="80"/>
               <w:jc w:val="left"/>
               <w:rPr>
-                <w:rFonts w:ascii="Arial" w:hAnsi="Arial" w:cs="Arial"/>
-                <w:color w:val="C00000"/>
-                <w:sz w:val="20"/>
-                <w:szCs w:val="20"/>
-              </w:rPr>
-            </w:pPr>
-            <w:r>
-              <w:rPr>
-                <w:rFonts w:eastAsia="Calibri" w:cs="Arial" w:ascii="Arial" w:hAnsi="Arial"/>
-                <w:color w:val="C00000"/>
-                <w:kern w:val="0"/>
-                <w:sz w:val="20"/>
-                <w:szCs w:val="20"/>
-                <w:lang w:val="en-US" w:eastAsia="en-US" w:bidi="ar-SA"/>
-              </w:rPr>
-              <w:t>&lt;yes/no&gt;</w:t>
+                <w:color w:val="55308D"/>
+              </w:rPr>
+            </w:pPr>
+            <w:r>
+              <w:rPr>
+                <w:rFonts w:eastAsia="Calibri" w:cs="Arial" w:ascii="Arial" w:hAnsi="Arial"/>
+                <w:color w:val="55308D"/>
+                <w:kern w:val="0"/>
+                <w:sz w:val="20"/>
+                <w:szCs w:val="20"/>
+                <w:lang w:val="en-US" w:eastAsia="en-US" w:bidi="ar-SA"/>
+              </w:rPr>
+              <w:t>yes</w:t>
             </w:r>
           </w:p>
         </w:tc>
@@ -2332,16 +2283,13 @@
               <w:spacing w:lineRule="auto" w:line="240" w:before="80" w:after="80"/>
               <w:jc w:val="left"/>
               <w:rPr>
-                <w:rFonts w:ascii="Arial" w:hAnsi="Arial" w:cs="Arial"/>
-                <w:color w:val="C00000"/>
-                <w:sz w:val="20"/>
-                <w:szCs w:val="20"/>
-              </w:rPr>
-            </w:pPr>
-            <w:r>
-              <w:rPr>
-                <w:rFonts w:eastAsia="Calibri" w:cs="Arial" w:ascii="Arial" w:hAnsi="Arial"/>
-                <w:color w:val="C00000"/>
+                <w:color w:val="1E6A39"/>
+              </w:rPr>
+            </w:pPr>
+            <w:r>
+              <w:rPr>
+                <w:rFonts w:eastAsia="Calibri" w:cs="Arial" w:ascii="Arial" w:hAnsi="Arial"/>
+                <w:color w:val="1E6A39"/>
                 <w:kern w:val="0"/>
                 <w:sz w:val="20"/>
                 <w:szCs w:val="20"/>
@@ -2454,7 +2402,18 @@
                 <w:szCs w:val="20"/>
                 <w:lang w:val="en-US" w:eastAsia="en-US" w:bidi="ar-SA"/>
               </w:rPr>
-              <w:t>The reservation is created successfully.</w:t>
+              <w:t>User is taken to a confirmation screen with accurate information</w:t>
+            </w:r>
+            <w:r>
+              <w:rPr>
+                <w:rFonts w:eastAsia="Calibri" w:cs="Arial" w:ascii="Arial" w:hAnsi="Arial"/>
+                <w:color w:val="C00000"/>
+                <w:kern w:val="0"/>
+                <w:sz w:val="20"/>
+                <w:szCs w:val="20"/>
+                <w:lang w:val="en-US" w:eastAsia="en-US" w:bidi="ar-SA"/>
+              </w:rPr>
+              <w:t>.</w:t>
             </w:r>
           </w:p>
         </w:tc>
@@ -2473,22 +2432,19 @@
               <w:spacing w:lineRule="auto" w:line="240" w:before="80" w:after="80"/>
               <w:jc w:val="left"/>
               <w:rPr>
-                <w:rFonts w:ascii="Arial" w:hAnsi="Arial" w:cs="Arial"/>
-                <w:color w:val="C00000"/>
-                <w:sz w:val="20"/>
-                <w:szCs w:val="20"/>
-              </w:rPr>
-            </w:pPr>
-            <w:r>
-              <w:rPr>
-                <w:rFonts w:eastAsia="Calibri" w:cs="Arial" w:ascii="Arial" w:hAnsi="Arial"/>
-                <w:color w:val="C00000"/>
-                <w:kern w:val="0"/>
-                <w:sz w:val="20"/>
-                <w:szCs w:val="20"/>
-                <w:lang w:val="en-US" w:eastAsia="en-US" w:bidi="ar-SA"/>
-              </w:rPr>
-              <w:t>&lt;yes/no&gt;</w:t>
+                <w:color w:val="55308D"/>
+              </w:rPr>
+            </w:pPr>
+            <w:r>
+              <w:rPr>
+                <w:rFonts w:eastAsia="Calibri" w:cs="Arial" w:ascii="Arial" w:hAnsi="Arial"/>
+                <w:color w:val="55308D"/>
+                <w:kern w:val="0"/>
+                <w:sz w:val="20"/>
+                <w:szCs w:val="20"/>
+                <w:lang w:val="en-US" w:eastAsia="en-US" w:bidi="ar-SA"/>
+              </w:rPr>
+              <w:t>yes</w:t>
             </w:r>
           </w:p>
         </w:tc>
@@ -2507,16 +2463,13 @@
               <w:spacing w:lineRule="auto" w:line="240" w:before="80" w:after="80"/>
               <w:jc w:val="left"/>
               <w:rPr>
-                <w:rFonts w:ascii="Arial" w:hAnsi="Arial" w:cs="Arial"/>
-                <w:color w:val="C00000"/>
-                <w:sz w:val="20"/>
-                <w:szCs w:val="20"/>
-              </w:rPr>
-            </w:pPr>
-            <w:r>
-              <w:rPr>
-                <w:rFonts w:eastAsia="Calibri" w:cs="Arial" w:ascii="Arial" w:hAnsi="Arial"/>
-                <w:color w:val="C00000"/>
+                <w:color w:val="1E6A39"/>
+              </w:rPr>
+            </w:pPr>
+            <w:r>
+              <w:rPr>
+                <w:rFonts w:eastAsia="Calibri" w:cs="Arial" w:ascii="Arial" w:hAnsi="Arial"/>
+                <w:color w:val="1E6A39"/>
                 <w:kern w:val="0"/>
                 <w:sz w:val="20"/>
                 <w:szCs w:val="20"/>
@@ -2534,6 +2487,172 @@
         <w:tc>
           <w:tcPr>
             <w:tcW w:w="1248" w:type="dxa"/>
+            <w:tcBorders>
+              <w:top w:val="nil"/>
+            </w:tcBorders>
+          </w:tcPr>
+          <w:p>
+            <w:pPr>
+              <w:pStyle w:val="Normal"/>
+              <w:widowControl/>
+              <w:suppressAutoHyphens w:val="true"/>
+              <w:spacing w:lineRule="auto" w:line="240" w:before="80" w:after="80"/>
+              <w:jc w:val="left"/>
+              <w:rPr>
+                <w:rFonts w:ascii="Arial" w:hAnsi="Arial" w:cs="Arial"/>
+                <w:sz w:val="20"/>
+                <w:szCs w:val="20"/>
+              </w:rPr>
+            </w:pPr>
+            <w:r>
+              <w:rPr>
+                <w:rFonts w:cs="Arial" w:ascii="Arial" w:hAnsi="Arial"/>
+                <w:sz w:val="20"/>
+                <w:szCs w:val="20"/>
+              </w:rPr>
+              <w:t>7</w:t>
+            </w:r>
+          </w:p>
+        </w:tc>
+        <w:tc>
+          <w:tcPr>
+            <w:tcW w:w="3573" w:type="dxa"/>
+            <w:tcBorders>
+              <w:top w:val="nil"/>
+            </w:tcBorders>
+          </w:tcPr>
+          <w:p>
+            <w:pPr>
+              <w:pStyle w:val="Normal"/>
+              <w:widowControl/>
+              <w:suppressAutoHyphens w:val="true"/>
+              <w:spacing w:lineRule="auto" w:line="240" w:before="80" w:after="80"/>
+              <w:jc w:val="left"/>
+              <w:rPr>
+                <w:rFonts w:ascii="Arial" w:hAnsi="Arial" w:eastAsia="Calibri" w:cs="Arial"/>
+                <w:color w:val="C9211E"/>
+                <w:kern w:val="0"/>
+                <w:sz w:val="20"/>
+                <w:szCs w:val="20"/>
+                <w:lang w:val="en-US" w:eastAsia="en-US" w:bidi="ar-SA"/>
+              </w:rPr>
+            </w:pPr>
+            <w:r>
+              <w:rPr>
+                <w:rFonts w:eastAsia="Calibri" w:cs="Arial" w:ascii="Arial" w:hAnsi="Arial"/>
+                <w:color w:val="C9211E"/>
+                <w:kern w:val="0"/>
+                <w:sz w:val="20"/>
+                <w:szCs w:val="20"/>
+                <w:lang w:val="en-US" w:eastAsia="en-US" w:bidi="ar-SA"/>
+              </w:rPr>
+              <w:t>Hit "Confirm Reservation".</w:t>
+            </w:r>
+          </w:p>
+        </w:tc>
+        <w:tc>
+          <w:tcPr>
+            <w:tcW w:w="3929" w:type="dxa"/>
+            <w:tcBorders>
+              <w:top w:val="nil"/>
+            </w:tcBorders>
+          </w:tcPr>
+          <w:p>
+            <w:pPr>
+              <w:pStyle w:val="Normal"/>
+              <w:widowControl/>
+              <w:suppressAutoHyphens w:val="true"/>
+              <w:spacing w:lineRule="auto" w:line="240" w:before="80" w:after="80"/>
+              <w:jc w:val="left"/>
+              <w:rPr>
+                <w:rFonts w:ascii="Arial" w:hAnsi="Arial" w:cs="Arial"/>
+                <w:color w:val="C00000"/>
+                <w:sz w:val="20"/>
+                <w:szCs w:val="20"/>
+              </w:rPr>
+            </w:pPr>
+            <w:r>
+              <w:rPr>
+                <w:rFonts w:cs="Arial" w:ascii="Arial" w:hAnsi="Arial"/>
+                <w:color w:val="C00000"/>
+                <w:sz w:val="20"/>
+                <w:szCs w:val="20"/>
+              </w:rPr>
+              <w:t>The reservation is created successfully.</w:t>
+            </w:r>
+          </w:p>
+        </w:tc>
+        <w:tc>
+          <w:tcPr>
+            <w:tcW w:w="2147" w:type="dxa"/>
+            <w:tcBorders>
+              <w:top w:val="nil"/>
+            </w:tcBorders>
+          </w:tcPr>
+          <w:p>
+            <w:pPr>
+              <w:pStyle w:val="Normal"/>
+              <w:widowControl/>
+              <w:suppressAutoHyphens w:val="true"/>
+              <w:spacing w:lineRule="auto" w:line="240" w:before="80" w:after="80"/>
+              <w:jc w:val="left"/>
+              <w:rPr>
+                <w:color w:val="55308D"/>
+              </w:rPr>
+            </w:pPr>
+            <w:r>
+              <w:rPr>
+                <w:rFonts w:eastAsia="Calibri" w:cs="Arial" w:ascii="Arial" w:hAnsi="Arial"/>
+                <w:color w:val="55308D"/>
+                <w:kern w:val="0"/>
+                <w:sz w:val="20"/>
+                <w:szCs w:val="20"/>
+                <w:lang w:val="en-US" w:eastAsia="en-US" w:bidi="ar-SA"/>
+              </w:rPr>
+              <w:t>yes</w:t>
+            </w:r>
+          </w:p>
+        </w:tc>
+        <w:tc>
+          <w:tcPr>
+            <w:tcW w:w="2053" w:type="dxa"/>
+            <w:tcBorders>
+              <w:top w:val="nil"/>
+            </w:tcBorders>
+          </w:tcPr>
+          <w:p>
+            <w:pPr>
+              <w:pStyle w:val="Normal"/>
+              <w:widowControl/>
+              <w:suppressAutoHyphens w:val="true"/>
+              <w:spacing w:lineRule="auto" w:line="240" w:before="80" w:after="80"/>
+              <w:jc w:val="left"/>
+              <w:rPr>
+                <w:rFonts w:ascii="Arial" w:hAnsi="Arial" w:cs="Arial"/>
+                <w:color w:val="1E6A39"/>
+                <w:sz w:val="20"/>
+                <w:szCs w:val="20"/>
+              </w:rPr>
+            </w:pPr>
+            <w:r>
+              <w:rPr>
+                <w:rFonts w:cs="Arial" w:ascii="Arial" w:hAnsi="Arial"/>
+                <w:color w:val="1E6A39"/>
+                <w:sz w:val="20"/>
+                <w:szCs w:val="20"/>
+              </w:rPr>
+              <w:t>&lt;yes/no&gt;</w:t>
+            </w:r>
+          </w:p>
+        </w:tc>
+      </w:tr>
+      <w:tr>
+        <w:trPr>
+          <w:trHeight w:val="350" w:hRule="atLeast"/>
+        </w:trPr>
+        <w:tc>
+          <w:tcPr>
+            <w:tcW w:w="1248" w:type="dxa"/>
             <w:tcBorders/>
           </w:tcPr>
           <w:p>
@@ -2579,16 +2698,13 @@
               <w:spacing w:lineRule="auto" w:line="240" w:before="80" w:after="80"/>
               <w:jc w:val="left"/>
               <w:rPr>
-                <w:rFonts w:ascii="Arial" w:hAnsi="Arial" w:cs="Arial"/>
-                <w:color w:val="C00000"/>
-                <w:sz w:val="20"/>
-                <w:szCs w:val="20"/>
-              </w:rPr>
-            </w:pPr>
-            <w:r>
-              <w:rPr>
-                <w:rFonts w:eastAsia="Calibri" w:cs="Arial" w:ascii="Arial" w:hAnsi="Arial"/>
-                <w:color w:val="C00000"/>
+                <w:color w:val="1E6A39"/>
+              </w:rPr>
+            </w:pPr>
+            <w:r>
+              <w:rPr>
+                <w:rFonts w:eastAsia="Calibri" w:cs="Arial" w:ascii="Arial" w:hAnsi="Arial"/>
+                <w:color w:val="1E6A39"/>
                 <w:kern w:val="0"/>
                 <w:sz w:val="20"/>
                 <w:szCs w:val="20"/>
@@ -2634,8 +2750,8 @@
       </w:tblPr>
       <w:tblGrid>
         <w:gridCol w:w="1248"/>
-        <w:gridCol w:w="3570"/>
-        <w:gridCol w:w="3932"/>
+        <w:gridCol w:w="3569"/>
+        <w:gridCol w:w="3933"/>
         <w:gridCol w:w="2147"/>
         <w:gridCol w:w="2053"/>
       </w:tblGrid>
@@ -2759,7 +2875,7 @@
         </w:tc>
         <w:tc>
           <w:tcPr>
-            <w:tcW w:w="3570" w:type="dxa"/>
+            <w:tcW w:w="3569" w:type="dxa"/>
             <w:tcBorders/>
           </w:tcPr>
           <w:p>
@@ -2804,7 +2920,7 @@
         </w:tc>
         <w:tc>
           <w:tcPr>
-            <w:tcW w:w="3932" w:type="dxa"/>
+            <w:tcW w:w="3933" w:type="dxa"/>
             <w:tcBorders/>
           </w:tcPr>
           <w:p>
@@ -2873,13 +2989,13 @@
             <w:r>
               <w:rPr>
                 <w:rFonts w:eastAsia="Calibri" w:cs="Arial" w:ascii="Arial" w:hAnsi="Arial"/>
-                <w:color w:val="C00000"/>
-                <w:kern w:val="0"/>
-                <w:sz w:val="20"/>
-                <w:szCs w:val="20"/>
-                <w:lang w:val="en-US" w:eastAsia="en-US" w:bidi="ar-SA"/>
-              </w:rPr>
-              <w:t>&lt;yyyy/mm/dd&gt;</w:t>
+                <w:color w:val="55308D"/>
+                <w:kern w:val="0"/>
+                <w:sz w:val="20"/>
+                <w:szCs w:val="20"/>
+                <w:lang w:val="en-US" w:eastAsia="en-US" w:bidi="ar-SA"/>
+              </w:rPr>
+              <w:t>2026/09/13</w:t>
             </w:r>
           </w:p>
         </w:tc>
@@ -2955,7 +3071,7 @@
             <w:r>
               <w:rPr>
                 <w:rFonts w:eastAsia="Calibri" w:cs="Arial" w:ascii="Arial" w:hAnsi="Arial"/>
-                <w:color w:val="C00000"/>
+                <w:color w:val="1E6A39"/>
                 <w:kern w:val="0"/>
                 <w:sz w:val="20"/>
                 <w:szCs w:val="20"/>
@@ -3006,7 +3122,7 @@
         </w:tc>
         <w:tc>
           <w:tcPr>
-            <w:tcW w:w="3570" w:type="dxa"/>
+            <w:tcW w:w="3569" w:type="dxa"/>
             <w:tcBorders/>
           </w:tcPr>
           <w:p>
@@ -3040,7 +3156,7 @@
         </w:tc>
         <w:tc>
           <w:tcPr>
-            <w:tcW w:w="3932" w:type="dxa"/>
+            <w:tcW w:w="3933" w:type="dxa"/>
             <w:tcBorders/>
           </w:tcPr>
           <w:p>
@@ -3177,7 +3293,7 @@
         </w:tc>
         <w:tc>
           <w:tcPr>
-            <w:tcW w:w="3570" w:type="dxa"/>
+            <w:tcW w:w="3569" w:type="dxa"/>
             <w:tcBorders/>
           </w:tcPr>
           <w:p>
@@ -3209,7 +3325,7 @@
         </w:tc>
         <w:tc>
           <w:tcPr>
-            <w:tcW w:w="3932" w:type="dxa"/>
+            <w:tcW w:w="3933" w:type="dxa"/>
             <w:tcBorders/>
           </w:tcPr>
           <w:p>
@@ -3249,22 +3365,19 @@
               <w:spacing w:lineRule="auto" w:line="240" w:before="80" w:after="80"/>
               <w:jc w:val="left"/>
               <w:rPr>
-                <w:rFonts w:ascii="Arial" w:hAnsi="Arial" w:cs="Arial"/>
-                <w:color w:val="C00000"/>
-                <w:sz w:val="20"/>
-                <w:szCs w:val="20"/>
-              </w:rPr>
-            </w:pPr>
-            <w:r>
-              <w:rPr>
-                <w:rFonts w:eastAsia="Calibri" w:cs="Arial" w:ascii="Arial" w:hAnsi="Arial"/>
-                <w:color w:val="C00000"/>
-                <w:kern w:val="0"/>
-                <w:sz w:val="20"/>
-                <w:szCs w:val="20"/>
-                <w:lang w:val="en-US" w:eastAsia="en-US" w:bidi="ar-SA"/>
-              </w:rPr>
-              <w:t>&lt;yes/no&gt;</w:t>
+                <w:color w:val="55308D"/>
+              </w:rPr>
+            </w:pPr>
+            <w:r>
+              <w:rPr>
+                <w:rFonts w:eastAsia="Calibri" w:cs="Arial" w:ascii="Arial" w:hAnsi="Arial"/>
+                <w:color w:val="55308D"/>
+                <w:kern w:val="0"/>
+                <w:sz w:val="20"/>
+                <w:szCs w:val="20"/>
+                <w:lang w:val="en-US" w:eastAsia="en-US" w:bidi="ar-SA"/>
+              </w:rPr>
+              <w:t>yes</w:t>
             </w:r>
           </w:p>
         </w:tc>
@@ -3281,16 +3394,13 @@
               <w:spacing w:lineRule="auto" w:line="240" w:before="80" w:after="80"/>
               <w:jc w:val="left"/>
               <w:rPr>
-                <w:rFonts w:ascii="Arial" w:hAnsi="Arial" w:cs="Arial"/>
-                <w:color w:val="C00000"/>
-                <w:sz w:val="20"/>
-                <w:szCs w:val="20"/>
-              </w:rPr>
-            </w:pPr>
-            <w:r>
-              <w:rPr>
-                <w:rFonts w:eastAsia="Calibri" w:cs="Arial" w:ascii="Arial" w:hAnsi="Arial"/>
-                <w:color w:val="C00000"/>
+                <w:color w:val="1E6A39"/>
+              </w:rPr>
+            </w:pPr>
+            <w:r>
+              <w:rPr>
+                <w:rFonts w:eastAsia="Calibri" w:cs="Arial" w:ascii="Arial" w:hAnsi="Arial"/>
+                <w:color w:val="1E6A39"/>
                 <w:kern w:val="0"/>
                 <w:sz w:val="20"/>
                 <w:szCs w:val="20"/>
@@ -3337,7 +3447,7 @@
         </w:tc>
         <w:tc>
           <w:tcPr>
-            <w:tcW w:w="3570" w:type="dxa"/>
+            <w:tcW w:w="3569" w:type="dxa"/>
             <w:tcBorders/>
           </w:tcPr>
           <w:p>
@@ -3369,7 +3479,7 @@
         </w:tc>
         <w:tc>
           <w:tcPr>
-            <w:tcW w:w="3932" w:type="dxa"/>
+            <w:tcW w:w="3933" w:type="dxa"/>
             <w:tcBorders/>
           </w:tcPr>
           <w:p>
@@ -3409,22 +3519,19 @@
               <w:spacing w:lineRule="auto" w:line="240" w:before="80" w:after="80"/>
               <w:jc w:val="left"/>
               <w:rPr>
-                <w:rFonts w:ascii="Arial" w:hAnsi="Arial" w:cs="Arial"/>
-                <w:color w:val="C00000"/>
-                <w:sz w:val="20"/>
-                <w:szCs w:val="20"/>
-              </w:rPr>
-            </w:pPr>
-            <w:r>
-              <w:rPr>
-                <w:rFonts w:eastAsia="Calibri" w:cs="Arial" w:ascii="Arial" w:hAnsi="Arial"/>
-                <w:color w:val="C00000"/>
-                <w:kern w:val="0"/>
-                <w:sz w:val="20"/>
-                <w:szCs w:val="20"/>
-                <w:lang w:val="en-US" w:eastAsia="en-US" w:bidi="ar-SA"/>
-              </w:rPr>
-              <w:t>&lt;yes/no&gt;</w:t>
+                <w:color w:val="55308D"/>
+              </w:rPr>
+            </w:pPr>
+            <w:r>
+              <w:rPr>
+                <w:rFonts w:eastAsia="Calibri" w:cs="Arial" w:ascii="Arial" w:hAnsi="Arial"/>
+                <w:color w:val="55308D"/>
+                <w:kern w:val="0"/>
+                <w:sz w:val="20"/>
+                <w:szCs w:val="20"/>
+                <w:lang w:val="en-US" w:eastAsia="en-US" w:bidi="ar-SA"/>
+              </w:rPr>
+              <w:t>yes</w:t>
             </w:r>
           </w:p>
         </w:tc>
@@ -3441,16 +3548,13 @@
               <w:spacing w:lineRule="auto" w:line="240" w:before="80" w:after="80"/>
               <w:jc w:val="left"/>
               <w:rPr>
-                <w:rFonts w:ascii="Arial" w:hAnsi="Arial" w:cs="Arial"/>
-                <w:color w:val="C00000"/>
-                <w:sz w:val="20"/>
-                <w:szCs w:val="20"/>
-              </w:rPr>
-            </w:pPr>
-            <w:r>
-              <w:rPr>
-                <w:rFonts w:eastAsia="Calibri" w:cs="Arial" w:ascii="Arial" w:hAnsi="Arial"/>
-                <w:color w:val="C00000"/>
+                <w:color w:val="1E6A39"/>
+              </w:rPr>
+            </w:pPr>
+            <w:r>
+              <w:rPr>
+                <w:rFonts w:eastAsia="Calibri" w:cs="Arial" w:ascii="Arial" w:hAnsi="Arial"/>
+                <w:color w:val="1E6A39"/>
                 <w:kern w:val="0"/>
                 <w:sz w:val="20"/>
                 <w:szCs w:val="20"/>
@@ -3497,7 +3601,7 @@
         </w:tc>
         <w:tc>
           <w:tcPr>
-            <w:tcW w:w="3570" w:type="dxa"/>
+            <w:tcW w:w="3569" w:type="dxa"/>
             <w:tcBorders/>
           </w:tcPr>
           <w:p>
@@ -3529,7 +3633,7 @@
         </w:tc>
         <w:tc>
           <w:tcPr>
-            <w:tcW w:w="3932" w:type="dxa"/>
+            <w:tcW w:w="3933" w:type="dxa"/>
             <w:tcBorders/>
           </w:tcPr>
           <w:p>
@@ -3572,22 +3676,19 @@
               <w:spacing w:lineRule="auto" w:line="240" w:before="80" w:after="80"/>
               <w:jc w:val="left"/>
               <w:rPr>
-                <w:rFonts w:ascii="Arial" w:hAnsi="Arial" w:cs="Arial"/>
-                <w:color w:val="C00000"/>
-                <w:sz w:val="20"/>
-                <w:szCs w:val="20"/>
-              </w:rPr>
-            </w:pPr>
-            <w:r>
-              <w:rPr>
-                <w:rFonts w:eastAsia="Calibri" w:cs="Arial" w:ascii="Arial" w:hAnsi="Arial"/>
-                <w:color w:val="C00000"/>
-                <w:kern w:val="0"/>
-                <w:sz w:val="20"/>
-                <w:szCs w:val="20"/>
-                <w:lang w:val="en-US" w:eastAsia="en-US" w:bidi="ar-SA"/>
-              </w:rPr>
-              <w:t>&lt;yes/no&gt;</w:t>
+                <w:color w:val="55308D"/>
+              </w:rPr>
+            </w:pPr>
+            <w:r>
+              <w:rPr>
+                <w:rFonts w:eastAsia="Calibri" w:cs="Arial" w:ascii="Arial" w:hAnsi="Arial"/>
+                <w:color w:val="55308D"/>
+                <w:kern w:val="0"/>
+                <w:sz w:val="20"/>
+                <w:szCs w:val="20"/>
+                <w:lang w:val="en-US" w:eastAsia="en-US" w:bidi="ar-SA"/>
+              </w:rPr>
+              <w:t>no; User is prevented, but comment visible at top of page</w:t>
             </w:r>
           </w:p>
         </w:tc>
@@ -3604,16 +3705,13 @@
               <w:spacing w:lineRule="auto" w:line="240" w:before="80" w:after="80"/>
               <w:jc w:val="left"/>
               <w:rPr>
-                <w:rFonts w:ascii="Arial" w:hAnsi="Arial" w:cs="Arial"/>
-                <w:color w:val="C00000"/>
-                <w:sz w:val="20"/>
-                <w:szCs w:val="20"/>
-              </w:rPr>
-            </w:pPr>
-            <w:r>
-              <w:rPr>
-                <w:rFonts w:eastAsia="Calibri" w:cs="Arial" w:ascii="Arial" w:hAnsi="Arial"/>
-                <w:color w:val="C00000"/>
+                <w:color w:val="1E6A39"/>
+              </w:rPr>
+            </w:pPr>
+            <w:r>
+              <w:rPr>
+                <w:rFonts w:eastAsia="Calibri" w:cs="Arial" w:ascii="Arial" w:hAnsi="Arial"/>
+                <w:color w:val="1E6A39"/>
                 <w:kern w:val="0"/>
                 <w:sz w:val="20"/>
                 <w:szCs w:val="20"/>
@@ -3676,16 +3774,13 @@
               <w:spacing w:lineRule="auto" w:line="240" w:before="80" w:after="80"/>
               <w:jc w:val="left"/>
               <w:rPr>
-                <w:rFonts w:ascii="Arial" w:hAnsi="Arial" w:cs="Arial"/>
-                <w:color w:val="C00000"/>
-                <w:sz w:val="20"/>
-                <w:szCs w:val="20"/>
-              </w:rPr>
-            </w:pPr>
-            <w:r>
-              <w:rPr>
-                <w:rFonts w:eastAsia="Calibri" w:cs="Arial" w:ascii="Arial" w:hAnsi="Arial"/>
-                <w:color w:val="C00000"/>
+                <w:color w:val="1E6A39"/>
+              </w:rPr>
+            </w:pPr>
+            <w:r>
+              <w:rPr>
+                <w:rFonts w:eastAsia="Calibri" w:cs="Arial" w:ascii="Arial" w:hAnsi="Arial"/>
+                <w:color w:val="1E6A39"/>
                 <w:kern w:val="0"/>
                 <w:sz w:val="20"/>
                 <w:szCs w:val="20"/>
@@ -3731,8 +3826,8 @@
       </w:tblPr>
       <w:tblGrid>
         <w:gridCol w:w="1248"/>
-        <w:gridCol w:w="3570"/>
-        <w:gridCol w:w="3932"/>
+        <w:gridCol w:w="3569"/>
+        <w:gridCol w:w="3933"/>
         <w:gridCol w:w="2147"/>
         <w:gridCol w:w="2053"/>
       </w:tblGrid>
@@ -3838,7 +3933,7 @@
         </w:tc>
         <w:tc>
           <w:tcPr>
-            <w:tcW w:w="3570" w:type="dxa"/>
+            <w:tcW w:w="3569" w:type="dxa"/>
             <w:tcBorders/>
           </w:tcPr>
           <w:p>
@@ -3883,7 +3978,7 @@
         </w:tc>
         <w:tc>
           <w:tcPr>
-            <w:tcW w:w="3932" w:type="dxa"/>
+            <w:tcW w:w="3933" w:type="dxa"/>
             <w:tcBorders/>
           </w:tcPr>
           <w:p>
@@ -3952,13 +4047,13 @@
             <w:r>
               <w:rPr>
                 <w:rFonts w:eastAsia="Calibri" w:cs="Arial" w:ascii="Arial" w:hAnsi="Arial"/>
-                <w:color w:val="C00000"/>
-                <w:kern w:val="0"/>
-                <w:sz w:val="20"/>
-                <w:szCs w:val="20"/>
-                <w:lang w:val="en-US" w:eastAsia="en-US" w:bidi="ar-SA"/>
-              </w:rPr>
-              <w:t>&lt;yyyy/mm/dd&gt;</w:t>
+                <w:color w:val="55308D"/>
+                <w:kern w:val="0"/>
+                <w:sz w:val="20"/>
+                <w:szCs w:val="20"/>
+                <w:lang w:val="en-US" w:eastAsia="en-US" w:bidi="ar-SA"/>
+              </w:rPr>
+              <w:t>2026/09/13</w:t>
             </w:r>
           </w:p>
         </w:tc>
@@ -4034,7 +4129,7 @@
             <w:r>
               <w:rPr>
                 <w:rFonts w:eastAsia="Calibri" w:cs="Arial" w:ascii="Arial" w:hAnsi="Arial"/>
-                <w:color w:val="C00000"/>
+                <w:color w:val="1E6A39"/>
                 <w:kern w:val="0"/>
                 <w:sz w:val="20"/>
                 <w:szCs w:val="20"/>
@@ -4085,7 +4180,7 @@
         </w:tc>
         <w:tc>
           <w:tcPr>
-            <w:tcW w:w="3570" w:type="dxa"/>
+            <w:tcW w:w="3569" w:type="dxa"/>
             <w:tcBorders/>
           </w:tcPr>
           <w:p>
@@ -4119,7 +4214,7 @@
         </w:tc>
         <w:tc>
           <w:tcPr>
-            <w:tcW w:w="3932" w:type="dxa"/>
+            <w:tcW w:w="3933" w:type="dxa"/>
             <w:tcBorders/>
           </w:tcPr>
           <w:p>
@@ -4256,7 +4351,7 @@
         </w:tc>
         <w:tc>
           <w:tcPr>
-            <w:tcW w:w="3570" w:type="dxa"/>
+            <w:tcW w:w="3569" w:type="dxa"/>
             <w:tcBorders/>
           </w:tcPr>
           <w:p>
@@ -4288,7 +4383,7 @@
         </w:tc>
         <w:tc>
           <w:tcPr>
-            <w:tcW w:w="3932" w:type="dxa"/>
+            <w:tcW w:w="3933" w:type="dxa"/>
             <w:tcBorders/>
           </w:tcPr>
           <w:p>
@@ -4328,22 +4423,19 @@
               <w:spacing w:lineRule="auto" w:line="240" w:before="80" w:after="80"/>
               <w:jc w:val="left"/>
               <w:rPr>
-                <w:rFonts w:ascii="Arial" w:hAnsi="Arial" w:cs="Arial"/>
-                <w:color w:val="C00000"/>
-                <w:sz w:val="20"/>
-                <w:szCs w:val="20"/>
-              </w:rPr>
-            </w:pPr>
-            <w:r>
-              <w:rPr>
-                <w:rFonts w:eastAsia="Calibri" w:cs="Arial" w:ascii="Arial" w:hAnsi="Arial"/>
-                <w:color w:val="C00000"/>
-                <w:kern w:val="0"/>
-                <w:sz w:val="20"/>
-                <w:szCs w:val="20"/>
-                <w:lang w:val="en-US" w:eastAsia="en-US" w:bidi="ar-SA"/>
-              </w:rPr>
-              <w:t>&lt;yes/no&gt;</w:t>
+                <w:color w:val="55308D"/>
+              </w:rPr>
+            </w:pPr>
+            <w:r>
+              <w:rPr>
+                <w:rFonts w:eastAsia="Calibri" w:cs="Arial" w:ascii="Arial" w:hAnsi="Arial"/>
+                <w:color w:val="55308D"/>
+                <w:kern w:val="0"/>
+                <w:sz w:val="20"/>
+                <w:szCs w:val="20"/>
+                <w:lang w:val="en-US" w:eastAsia="en-US" w:bidi="ar-SA"/>
+              </w:rPr>
+              <w:t>yes</w:t>
             </w:r>
           </w:p>
         </w:tc>
@@ -4360,16 +4452,13 @@
               <w:spacing w:lineRule="auto" w:line="240" w:before="80" w:after="80"/>
               <w:jc w:val="left"/>
               <w:rPr>
-                <w:rFonts w:ascii="Arial" w:hAnsi="Arial" w:cs="Arial"/>
-                <w:color w:val="C00000"/>
-                <w:sz w:val="20"/>
-                <w:szCs w:val="20"/>
-              </w:rPr>
-            </w:pPr>
-            <w:r>
-              <w:rPr>
-                <w:rFonts w:eastAsia="Calibri" w:cs="Arial" w:ascii="Arial" w:hAnsi="Arial"/>
-                <w:color w:val="C00000"/>
+                <w:color w:val="1E6A39"/>
+              </w:rPr>
+            </w:pPr>
+            <w:r>
+              <w:rPr>
+                <w:rFonts w:eastAsia="Calibri" w:cs="Arial" w:ascii="Arial" w:hAnsi="Arial"/>
+                <w:color w:val="1E6A39"/>
                 <w:kern w:val="0"/>
                 <w:sz w:val="20"/>
                 <w:szCs w:val="20"/>
@@ -4416,7 +4505,7 @@
         </w:tc>
         <w:tc>
           <w:tcPr>
-            <w:tcW w:w="3570" w:type="dxa"/>
+            <w:tcW w:w="3569" w:type="dxa"/>
             <w:tcBorders/>
           </w:tcPr>
           <w:p>
@@ -4448,7 +4537,7 @@
         </w:tc>
         <w:tc>
           <w:tcPr>
-            <w:tcW w:w="3932" w:type="dxa"/>
+            <w:tcW w:w="3933" w:type="dxa"/>
             <w:tcBorders/>
           </w:tcPr>
           <w:p>
@@ -4491,22 +4580,19 @@
               <w:spacing w:lineRule="auto" w:line="240" w:before="80" w:after="80"/>
               <w:jc w:val="left"/>
               <w:rPr>
-                <w:rFonts w:ascii="Arial" w:hAnsi="Arial" w:cs="Arial"/>
-                <w:color w:val="C00000"/>
-                <w:sz w:val="20"/>
-                <w:szCs w:val="20"/>
-              </w:rPr>
-            </w:pPr>
-            <w:r>
-              <w:rPr>
-                <w:rFonts w:eastAsia="Calibri" w:cs="Arial" w:ascii="Arial" w:hAnsi="Arial"/>
-                <w:color w:val="C00000"/>
-                <w:kern w:val="0"/>
-                <w:sz w:val="20"/>
-                <w:szCs w:val="20"/>
-                <w:lang w:val="en-US" w:eastAsia="en-US" w:bidi="ar-SA"/>
-              </w:rPr>
-              <w:t>&lt;yes/no&gt;</w:t>
+                <w:color w:val="55308D"/>
+              </w:rPr>
+            </w:pPr>
+            <w:r>
+              <w:rPr>
+                <w:rFonts w:eastAsia="Calibri" w:cs="Arial" w:ascii="Arial" w:hAnsi="Arial"/>
+                <w:color w:val="55308D"/>
+                <w:kern w:val="0"/>
+                <w:sz w:val="20"/>
+                <w:szCs w:val="20"/>
+                <w:lang w:val="en-US" w:eastAsia="en-US" w:bidi="ar-SA"/>
+              </w:rPr>
+              <w:t>yes</w:t>
             </w:r>
           </w:p>
         </w:tc>
@@ -4523,16 +4609,13 @@
               <w:spacing w:lineRule="auto" w:line="240" w:before="80" w:after="80"/>
               <w:jc w:val="left"/>
               <w:rPr>
-                <w:rFonts w:ascii="Arial" w:hAnsi="Arial" w:cs="Arial"/>
-                <w:color w:val="C00000"/>
-                <w:sz w:val="20"/>
-                <w:szCs w:val="20"/>
-              </w:rPr>
-            </w:pPr>
-            <w:r>
-              <w:rPr>
-                <w:rFonts w:eastAsia="Calibri" w:cs="Arial" w:ascii="Arial" w:hAnsi="Arial"/>
-                <w:color w:val="C00000"/>
+                <w:color w:val="1E6A39"/>
+              </w:rPr>
+            </w:pPr>
+            <w:r>
+              <w:rPr>
+                <w:rFonts w:eastAsia="Calibri" w:cs="Arial" w:ascii="Arial" w:hAnsi="Arial"/>
+                <w:color w:val="1E6A39"/>
                 <w:kern w:val="0"/>
                 <w:sz w:val="20"/>
                 <w:szCs w:val="20"/>
@@ -4579,7 +4662,7 @@
         </w:tc>
         <w:tc>
           <w:tcPr>
-            <w:tcW w:w="3570" w:type="dxa"/>
+            <w:tcW w:w="3569" w:type="dxa"/>
             <w:tcBorders/>
           </w:tcPr>
           <w:p>
@@ -4611,7 +4694,7 @@
         </w:tc>
         <w:tc>
           <w:tcPr>
-            <w:tcW w:w="3932" w:type="dxa"/>
+            <w:tcW w:w="3933" w:type="dxa"/>
             <w:tcBorders/>
           </w:tcPr>
           <w:p>
@@ -4734,22 +4817,19 @@
               <w:spacing w:lineRule="auto" w:line="240" w:before="80" w:after="80"/>
               <w:jc w:val="left"/>
               <w:rPr>
-                <w:rFonts w:ascii="Arial" w:hAnsi="Arial" w:cs="Arial"/>
-                <w:color w:val="C00000"/>
-                <w:sz w:val="20"/>
-                <w:szCs w:val="20"/>
-              </w:rPr>
-            </w:pPr>
-            <w:r>
-              <w:rPr>
-                <w:rFonts w:eastAsia="Calibri" w:cs="Arial" w:ascii="Arial" w:hAnsi="Arial"/>
-                <w:color w:val="C00000"/>
-                <w:kern w:val="0"/>
-                <w:sz w:val="20"/>
-                <w:szCs w:val="20"/>
-                <w:lang w:val="en-US" w:eastAsia="en-US" w:bidi="ar-SA"/>
-              </w:rPr>
-              <w:t>&lt;yes/no&gt;</w:t>
+                <w:color w:val="55308D"/>
+              </w:rPr>
+            </w:pPr>
+            <w:r>
+              <w:rPr>
+                <w:rFonts w:eastAsia="Calibri" w:cs="Arial" w:ascii="Arial" w:hAnsi="Arial"/>
+                <w:color w:val="55308D"/>
+                <w:kern w:val="0"/>
+                <w:sz w:val="20"/>
+                <w:szCs w:val="20"/>
+                <w:lang w:val="en-US" w:eastAsia="en-US" w:bidi="ar-SA"/>
+              </w:rPr>
+              <w:t>yes</w:t>
             </w:r>
           </w:p>
         </w:tc>
@@ -4766,16 +4846,13 @@
               <w:spacing w:lineRule="auto" w:line="240" w:before="80" w:after="80"/>
               <w:jc w:val="left"/>
               <w:rPr>
-                <w:rFonts w:ascii="Arial" w:hAnsi="Arial" w:cs="Arial"/>
-                <w:color w:val="C00000"/>
-                <w:sz w:val="20"/>
-                <w:szCs w:val="20"/>
-              </w:rPr>
-            </w:pPr>
-            <w:r>
-              <w:rPr>
-                <w:rFonts w:eastAsia="Calibri" w:cs="Arial" w:ascii="Arial" w:hAnsi="Arial"/>
-                <w:color w:val="C00000"/>
+                <w:color w:val="1E6A39"/>
+              </w:rPr>
+            </w:pPr>
+            <w:r>
+              <w:rPr>
+                <w:rFonts w:eastAsia="Calibri" w:cs="Arial" w:ascii="Arial" w:hAnsi="Arial"/>
+                <w:color w:val="1E6A39"/>
                 <w:kern w:val="0"/>
                 <w:sz w:val="20"/>
                 <w:szCs w:val="20"/>
@@ -4822,39 +4899,61 @@
         </w:tc>
         <w:tc>
           <w:tcPr>
-            <w:tcW w:w="3570" w:type="dxa"/>
-            <w:tcBorders/>
-          </w:tcPr>
-          <w:p>
-            <w:pPr>
-              <w:pStyle w:val="Normal"/>
-              <w:widowControl/>
-              <w:suppressAutoHyphens w:val="true"/>
-              <w:spacing w:lineRule="auto" w:line="240" w:before="80" w:after="80"/>
-              <w:jc w:val="left"/>
-              <w:rPr>
-                <w:rFonts w:ascii="Arial" w:hAnsi="Arial" w:cs="Arial"/>
-                <w:color w:val="C00000"/>
-                <w:sz w:val="20"/>
-                <w:szCs w:val="20"/>
-              </w:rPr>
-            </w:pPr>
-            <w:r>
-              <w:rPr>
-                <w:rFonts w:eastAsia="Calibri" w:cs="Arial" w:ascii="Arial" w:hAnsi="Arial"/>
-                <w:color w:val="C00000"/>
-                <w:kern w:val="0"/>
-                <w:sz w:val="20"/>
-                <w:szCs w:val="20"/>
-                <w:lang w:val="en-US" w:eastAsia="en-US" w:bidi="ar-SA"/>
-              </w:rPr>
-              <w:t>Select "Double Queen" and 2 guests. Select the 5th and the 6th of the current month.</w:t>
-            </w:r>
-          </w:p>
-        </w:tc>
-        <w:tc>
-          <w:tcPr>
-            <w:tcW w:w="3932" w:type="dxa"/>
+            <w:tcW w:w="3569" w:type="dxa"/>
+            <w:tcBorders/>
+          </w:tcPr>
+          <w:p>
+            <w:pPr>
+              <w:pStyle w:val="Normal"/>
+              <w:widowControl/>
+              <w:suppressAutoHyphens w:val="true"/>
+              <w:spacing w:lineRule="auto" w:line="240" w:before="80" w:after="80"/>
+              <w:jc w:val="left"/>
+              <w:rPr>
+                <w:rFonts w:ascii="Arial" w:hAnsi="Arial" w:cs="Arial"/>
+                <w:color w:val="C00000"/>
+                <w:sz w:val="20"/>
+                <w:szCs w:val="20"/>
+              </w:rPr>
+            </w:pPr>
+            <w:r>
+              <w:rPr>
+                <w:rFonts w:eastAsia="Calibri" w:cs="Arial" w:ascii="Arial" w:hAnsi="Arial"/>
+                <w:color w:val="C00000"/>
+                <w:kern w:val="0"/>
+                <w:sz w:val="20"/>
+                <w:szCs w:val="20"/>
+                <w:lang w:val="en-US" w:eastAsia="en-US" w:bidi="ar-SA"/>
+              </w:rPr>
+              <w:t xml:space="preserve">Select "Double Queen" and 2 guests. Select the 5th and the 6th of the </w:t>
+            </w:r>
+            <w:r>
+              <w:rPr>
+                <w:rFonts w:eastAsia="Calibri" w:cs="Arial" w:ascii="Arial" w:hAnsi="Arial"/>
+                <w:color w:val="C00000"/>
+                <w:kern w:val="0"/>
+                <w:sz w:val="20"/>
+                <w:szCs w:val="20"/>
+                <w:lang w:val="en-US" w:eastAsia="en-US" w:bidi="ar-SA"/>
+              </w:rPr>
+              <w:t>current (or next available)</w:t>
+            </w:r>
+            <w:r>
+              <w:rPr>
+                <w:rFonts w:eastAsia="Calibri" w:cs="Arial" w:ascii="Arial" w:hAnsi="Arial"/>
+                <w:color w:val="C00000"/>
+                <w:kern w:val="0"/>
+                <w:sz w:val="20"/>
+                <w:szCs w:val="20"/>
+                <w:lang w:val="en-US" w:eastAsia="en-US" w:bidi="ar-SA"/>
+              </w:rPr>
+              <w:t xml:space="preserve"> month.</w:t>
+            </w:r>
+          </w:p>
+        </w:tc>
+        <w:tc>
+          <w:tcPr>
+            <w:tcW w:w="3933" w:type="dxa"/>
             <w:tcBorders/>
           </w:tcPr>
           <w:p>
@@ -4897,22 +4996,19 @@
               <w:spacing w:lineRule="auto" w:line="240" w:before="80" w:after="80"/>
               <w:jc w:val="left"/>
               <w:rPr>
-                <w:rFonts w:ascii="Arial" w:hAnsi="Arial" w:cs="Arial"/>
-                <w:color w:val="C00000"/>
-                <w:sz w:val="20"/>
-                <w:szCs w:val="20"/>
-              </w:rPr>
-            </w:pPr>
-            <w:r>
-              <w:rPr>
-                <w:rFonts w:eastAsia="Calibri" w:cs="Arial" w:ascii="Arial" w:hAnsi="Arial"/>
-                <w:color w:val="C00000"/>
-                <w:kern w:val="0"/>
-                <w:sz w:val="20"/>
-                <w:szCs w:val="20"/>
-                <w:lang w:val="en-US" w:eastAsia="en-US" w:bidi="ar-SA"/>
-              </w:rPr>
-              <w:t>&lt;yes/no&gt;</w:t>
+                <w:color w:val="55308D"/>
+              </w:rPr>
+            </w:pPr>
+            <w:r>
+              <w:rPr>
+                <w:rFonts w:eastAsia="Calibri" w:cs="Arial" w:ascii="Arial" w:hAnsi="Arial"/>
+                <w:color w:val="55308D"/>
+                <w:kern w:val="0"/>
+                <w:sz w:val="20"/>
+                <w:szCs w:val="20"/>
+                <w:lang w:val="en-US" w:eastAsia="en-US" w:bidi="ar-SA"/>
+              </w:rPr>
+              <w:t>yes</w:t>
             </w:r>
           </w:p>
         </w:tc>
@@ -4929,16 +5025,13 @@
               <w:spacing w:lineRule="auto" w:line="240" w:before="80" w:after="80"/>
               <w:jc w:val="left"/>
               <w:rPr>
-                <w:rFonts w:ascii="Arial" w:hAnsi="Arial" w:cs="Arial"/>
-                <w:color w:val="C00000"/>
-                <w:sz w:val="20"/>
-                <w:szCs w:val="20"/>
-              </w:rPr>
-            </w:pPr>
-            <w:r>
-              <w:rPr>
-                <w:rFonts w:eastAsia="Calibri" w:cs="Arial" w:ascii="Arial" w:hAnsi="Arial"/>
-                <w:color w:val="C00000"/>
+                <w:color w:val="1E6A39"/>
+              </w:rPr>
+            </w:pPr>
+            <w:r>
+              <w:rPr>
+                <w:rFonts w:eastAsia="Calibri" w:cs="Arial" w:ascii="Arial" w:hAnsi="Arial"/>
+                <w:color w:val="1E6A39"/>
                 <w:kern w:val="0"/>
                 <w:sz w:val="20"/>
                 <w:szCs w:val="20"/>
@@ -4985,7 +5078,7 @@
         </w:tc>
         <w:tc>
           <w:tcPr>
-            <w:tcW w:w="3570" w:type="dxa"/>
+            <w:tcW w:w="3569" w:type="dxa"/>
             <w:tcBorders/>
           </w:tcPr>
           <w:p>
@@ -5017,7 +5110,7 @@
         </w:tc>
         <w:tc>
           <w:tcPr>
-            <w:tcW w:w="3932" w:type="dxa"/>
+            <w:tcW w:w="3933" w:type="dxa"/>
             <w:tcBorders/>
           </w:tcPr>
           <w:p>
@@ -5060,22 +5153,19 @@
               <w:spacing w:lineRule="auto" w:line="240" w:before="80" w:after="80"/>
               <w:jc w:val="left"/>
               <w:rPr>
-                <w:rFonts w:ascii="Arial" w:hAnsi="Arial" w:cs="Arial"/>
-                <w:color w:val="C00000"/>
-                <w:sz w:val="20"/>
-                <w:szCs w:val="20"/>
-              </w:rPr>
-            </w:pPr>
-            <w:r>
-              <w:rPr>
-                <w:rFonts w:eastAsia="Calibri" w:cs="Arial" w:ascii="Arial" w:hAnsi="Arial"/>
-                <w:color w:val="C00000"/>
-                <w:kern w:val="0"/>
-                <w:sz w:val="20"/>
-                <w:szCs w:val="20"/>
-                <w:lang w:val="en-US" w:eastAsia="en-US" w:bidi="ar-SA"/>
-              </w:rPr>
-              <w:t>&lt;yes/no&gt;</w:t>
+                <w:color w:val="55308D"/>
+              </w:rPr>
+            </w:pPr>
+            <w:r>
+              <w:rPr>
+                <w:rFonts w:eastAsia="Calibri" w:cs="Arial" w:ascii="Arial" w:hAnsi="Arial"/>
+                <w:color w:val="55308D"/>
+                <w:kern w:val="0"/>
+                <w:sz w:val="20"/>
+                <w:szCs w:val="20"/>
+                <w:lang w:val="en-US" w:eastAsia="en-US" w:bidi="ar-SA"/>
+              </w:rPr>
+              <w:t>yes</w:t>
             </w:r>
           </w:p>
         </w:tc>
@@ -5092,16 +5182,13 @@
               <w:spacing w:lineRule="auto" w:line="240" w:before="80" w:after="80"/>
               <w:jc w:val="left"/>
               <w:rPr>
-                <w:rFonts w:ascii="Arial" w:hAnsi="Arial" w:cs="Arial"/>
-                <w:color w:val="C00000"/>
-                <w:sz w:val="20"/>
-                <w:szCs w:val="20"/>
-              </w:rPr>
-            </w:pPr>
-            <w:r>
-              <w:rPr>
-                <w:rFonts w:eastAsia="Calibri" w:cs="Arial" w:ascii="Arial" w:hAnsi="Arial"/>
-                <w:color w:val="C00000"/>
+                <w:color w:val="1E6A39"/>
+              </w:rPr>
+            </w:pPr>
+            <w:r>
+              <w:rPr>
+                <w:rFonts w:eastAsia="Calibri" w:cs="Arial" w:ascii="Arial" w:hAnsi="Arial"/>
+                <w:color w:val="1E6A39"/>
                 <w:kern w:val="0"/>
                 <w:sz w:val="20"/>
                 <w:szCs w:val="20"/>
@@ -5164,16 +5251,13 @@
               <w:spacing w:lineRule="auto" w:line="240" w:before="80" w:after="80"/>
               <w:jc w:val="left"/>
               <w:rPr>
-                <w:rFonts w:ascii="Arial" w:hAnsi="Arial" w:cs="Arial"/>
-                <w:color w:val="C00000"/>
-                <w:sz w:val="20"/>
-                <w:szCs w:val="20"/>
-              </w:rPr>
-            </w:pPr>
-            <w:r>
-              <w:rPr>
-                <w:rFonts w:eastAsia="Calibri" w:cs="Arial" w:ascii="Arial" w:hAnsi="Arial"/>
-                <w:color w:val="C00000"/>
+                <w:color w:val="1E6A39"/>
+              </w:rPr>
+            </w:pPr>
+            <w:r>
+              <w:rPr>
+                <w:rFonts w:eastAsia="Calibri" w:cs="Arial" w:ascii="Arial" w:hAnsi="Arial"/>
+                <w:color w:val="1E6A39"/>
                 <w:kern w:val="0"/>
                 <w:sz w:val="20"/>
                 <w:szCs w:val="20"/>
@@ -5236,8 +5320,8 @@
       </w:tblPr>
       <w:tblGrid>
         <w:gridCol w:w="1248"/>
-        <w:gridCol w:w="3570"/>
-        <w:gridCol w:w="3932"/>
+        <w:gridCol w:w="3569"/>
+        <w:gridCol w:w="3933"/>
         <w:gridCol w:w="2147"/>
         <w:gridCol w:w="2053"/>
       </w:tblGrid>
@@ -5356,7 +5440,7 @@
         </w:tc>
         <w:tc>
           <w:tcPr>
-            <w:tcW w:w="3570" w:type="dxa"/>
+            <w:tcW w:w="3569" w:type="dxa"/>
             <w:tcBorders/>
           </w:tcPr>
           <w:p>
@@ -5401,7 +5485,7 @@
         </w:tc>
         <w:tc>
           <w:tcPr>
-            <w:tcW w:w="3932" w:type="dxa"/>
+            <w:tcW w:w="3933" w:type="dxa"/>
             <w:tcBorders/>
           </w:tcPr>
           <w:p>
@@ -5470,13 +5554,13 @@
             <w:r>
               <w:rPr>
                 <w:rFonts w:eastAsia="Calibri" w:cs="Arial" w:ascii="Arial" w:hAnsi="Arial"/>
-                <w:color w:val="C00000"/>
-                <w:kern w:val="0"/>
-                <w:sz w:val="20"/>
-                <w:szCs w:val="20"/>
-                <w:lang w:val="en-US" w:eastAsia="en-US" w:bidi="ar-SA"/>
-              </w:rPr>
-              <w:t>&lt;yyyy/mm/dd&gt;</w:t>
+                <w:color w:val="55308D"/>
+                <w:kern w:val="0"/>
+                <w:sz w:val="20"/>
+                <w:szCs w:val="20"/>
+                <w:lang w:val="en-US" w:eastAsia="en-US" w:bidi="ar-SA"/>
+              </w:rPr>
+              <w:t>2026/09/13</w:t>
             </w:r>
           </w:p>
         </w:tc>
@@ -5552,7 +5636,7 @@
             <w:r>
               <w:rPr>
                 <w:rFonts w:eastAsia="Calibri" w:cs="Arial" w:ascii="Arial" w:hAnsi="Arial"/>
-                <w:color w:val="C00000"/>
+                <w:color w:val="1E6A39"/>
                 <w:kern w:val="0"/>
                 <w:sz w:val="20"/>
                 <w:szCs w:val="20"/>
@@ -5603,7 +5687,7 @@
         </w:tc>
         <w:tc>
           <w:tcPr>
-            <w:tcW w:w="3570" w:type="dxa"/>
+            <w:tcW w:w="3569" w:type="dxa"/>
             <w:tcBorders/>
           </w:tcPr>
           <w:p>
@@ -5637,7 +5721,7 @@
         </w:tc>
         <w:tc>
           <w:tcPr>
-            <w:tcW w:w="3932" w:type="dxa"/>
+            <w:tcW w:w="3933" w:type="dxa"/>
             <w:tcBorders/>
           </w:tcPr>
           <w:p>
@@ -5774,7 +5858,7 @@
         </w:tc>
         <w:tc>
           <w:tcPr>
-            <w:tcW w:w="3570" w:type="dxa"/>
+            <w:tcW w:w="3569" w:type="dxa"/>
             <w:tcBorders/>
           </w:tcPr>
           <w:p>
@@ -5806,7 +5890,7 @@
         </w:tc>
         <w:tc>
           <w:tcPr>
-            <w:tcW w:w="3932" w:type="dxa"/>
+            <w:tcW w:w="3933" w:type="dxa"/>
             <w:tcBorders/>
           </w:tcPr>
           <w:p>
@@ -5846,22 +5930,19 @@
               <w:spacing w:lineRule="auto" w:line="240" w:before="80" w:after="80"/>
               <w:jc w:val="left"/>
               <w:rPr>
-                <w:rFonts w:ascii="Arial" w:hAnsi="Arial" w:cs="Arial"/>
-                <w:color w:val="C00000"/>
-                <w:sz w:val="20"/>
-                <w:szCs w:val="20"/>
-              </w:rPr>
-            </w:pPr>
-            <w:r>
-              <w:rPr>
-                <w:rFonts w:eastAsia="Calibri" w:cs="Arial" w:ascii="Arial" w:hAnsi="Arial"/>
-                <w:color w:val="C00000"/>
-                <w:kern w:val="0"/>
-                <w:sz w:val="20"/>
-                <w:szCs w:val="20"/>
-                <w:lang w:val="en-US" w:eastAsia="en-US" w:bidi="ar-SA"/>
-              </w:rPr>
-              <w:t>&lt;yes/no&gt;</w:t>
+                <w:color w:val="55308D"/>
+              </w:rPr>
+            </w:pPr>
+            <w:r>
+              <w:rPr>
+                <w:rFonts w:eastAsia="Calibri" w:cs="Arial" w:ascii="Arial" w:hAnsi="Arial"/>
+                <w:color w:val="55308D"/>
+                <w:kern w:val="0"/>
+                <w:sz w:val="20"/>
+                <w:szCs w:val="20"/>
+                <w:lang w:val="en-US" w:eastAsia="en-US" w:bidi="ar-SA"/>
+              </w:rPr>
+              <w:t>yes</w:t>
             </w:r>
           </w:p>
         </w:tc>
@@ -5878,16 +5959,13 @@
               <w:spacing w:lineRule="auto" w:line="240" w:before="80" w:after="80"/>
               <w:jc w:val="left"/>
               <w:rPr>
-                <w:rFonts w:ascii="Arial" w:hAnsi="Arial" w:cs="Arial"/>
-                <w:color w:val="C00000"/>
-                <w:sz w:val="20"/>
-                <w:szCs w:val="20"/>
-              </w:rPr>
-            </w:pPr>
-            <w:r>
-              <w:rPr>
-                <w:rFonts w:eastAsia="Calibri" w:cs="Arial" w:ascii="Arial" w:hAnsi="Arial"/>
-                <w:color w:val="C00000"/>
+                <w:color w:val="1E6A39"/>
+              </w:rPr>
+            </w:pPr>
+            <w:r>
+              <w:rPr>
+                <w:rFonts w:eastAsia="Calibri" w:cs="Arial" w:ascii="Arial" w:hAnsi="Arial"/>
+                <w:color w:val="1E6A39"/>
                 <w:kern w:val="0"/>
                 <w:sz w:val="20"/>
                 <w:szCs w:val="20"/>
@@ -5934,7 +6012,7 @@
         </w:tc>
         <w:tc>
           <w:tcPr>
-            <w:tcW w:w="3570" w:type="dxa"/>
+            <w:tcW w:w="3569" w:type="dxa"/>
             <w:tcBorders/>
           </w:tcPr>
           <w:p>
@@ -5966,7 +6044,7 @@
         </w:tc>
         <w:tc>
           <w:tcPr>
-            <w:tcW w:w="3932" w:type="dxa"/>
+            <w:tcW w:w="3933" w:type="dxa"/>
             <w:tcBorders/>
           </w:tcPr>
           <w:p>
@@ -6006,22 +6084,19 @@
               <w:spacing w:lineRule="auto" w:line="240" w:before="80" w:after="80"/>
               <w:jc w:val="left"/>
               <w:rPr>
-                <w:rFonts w:ascii="Arial" w:hAnsi="Arial" w:cs="Arial"/>
-                <w:color w:val="C00000"/>
-                <w:sz w:val="20"/>
-                <w:szCs w:val="20"/>
-              </w:rPr>
-            </w:pPr>
-            <w:r>
-              <w:rPr>
-                <w:rFonts w:eastAsia="Calibri" w:cs="Arial" w:ascii="Arial" w:hAnsi="Arial"/>
-                <w:color w:val="C00000"/>
-                <w:kern w:val="0"/>
-                <w:sz w:val="20"/>
-                <w:szCs w:val="20"/>
-                <w:lang w:val="en-US" w:eastAsia="en-US" w:bidi="ar-SA"/>
-              </w:rPr>
-              <w:t>&lt;yes/no&gt;</w:t>
+                <w:color w:val="55308D"/>
+              </w:rPr>
+            </w:pPr>
+            <w:r>
+              <w:rPr>
+                <w:rFonts w:eastAsia="Calibri" w:cs="Arial" w:ascii="Arial" w:hAnsi="Arial"/>
+                <w:color w:val="55308D"/>
+                <w:kern w:val="0"/>
+                <w:sz w:val="20"/>
+                <w:szCs w:val="20"/>
+                <w:lang w:val="en-US" w:eastAsia="en-US" w:bidi="ar-SA"/>
+              </w:rPr>
+              <w:t>yes</w:t>
             </w:r>
           </w:p>
         </w:tc>
@@ -6038,16 +6113,13 @@
               <w:spacing w:lineRule="auto" w:line="240" w:before="80" w:after="80"/>
               <w:jc w:val="left"/>
               <w:rPr>
-                <w:rFonts w:ascii="Arial" w:hAnsi="Arial" w:cs="Arial"/>
-                <w:color w:val="C00000"/>
-                <w:sz w:val="20"/>
-                <w:szCs w:val="20"/>
-              </w:rPr>
-            </w:pPr>
-            <w:r>
-              <w:rPr>
-                <w:rFonts w:eastAsia="Calibri" w:cs="Arial" w:ascii="Arial" w:hAnsi="Arial"/>
-                <w:color w:val="C00000"/>
+                <w:color w:val="1E6A39"/>
+              </w:rPr>
+            </w:pPr>
+            <w:r>
+              <w:rPr>
+                <w:rFonts w:eastAsia="Calibri" w:cs="Arial" w:ascii="Arial" w:hAnsi="Arial"/>
+                <w:color w:val="1E6A39"/>
                 <w:kern w:val="0"/>
                 <w:sz w:val="20"/>
                 <w:szCs w:val="20"/>
@@ -6094,7 +6166,7 @@
         </w:tc>
         <w:tc>
           <w:tcPr>
-            <w:tcW w:w="3570" w:type="dxa"/>
+            <w:tcW w:w="3569" w:type="dxa"/>
             <w:tcBorders/>
           </w:tcPr>
           <w:p>
@@ -6126,7 +6198,7 @@
         </w:tc>
         <w:tc>
           <w:tcPr>
-            <w:tcW w:w="3932" w:type="dxa"/>
+            <w:tcW w:w="3933" w:type="dxa"/>
             <w:tcBorders/>
           </w:tcPr>
           <w:p>
@@ -6166,22 +6238,19 @@
               <w:spacing w:lineRule="auto" w:line="240" w:before="80" w:after="80"/>
               <w:jc w:val="left"/>
               <w:rPr>
-                <w:rFonts w:ascii="Arial" w:hAnsi="Arial" w:cs="Arial"/>
-                <w:color w:val="C00000"/>
-                <w:sz w:val="20"/>
-                <w:szCs w:val="20"/>
-              </w:rPr>
-            </w:pPr>
-            <w:r>
-              <w:rPr>
-                <w:rFonts w:eastAsia="Calibri" w:cs="Arial" w:ascii="Arial" w:hAnsi="Arial"/>
-                <w:color w:val="C00000"/>
-                <w:kern w:val="0"/>
-                <w:sz w:val="20"/>
-                <w:szCs w:val="20"/>
-                <w:lang w:val="en-US" w:eastAsia="en-US" w:bidi="ar-SA"/>
-              </w:rPr>
-              <w:t>&lt;yes/no&gt;</w:t>
+                <w:color w:val="55308D"/>
+              </w:rPr>
+            </w:pPr>
+            <w:r>
+              <w:rPr>
+                <w:rFonts w:eastAsia="Calibri" w:cs="Arial" w:ascii="Arial" w:hAnsi="Arial"/>
+                <w:color w:val="55308D"/>
+                <w:kern w:val="0"/>
+                <w:sz w:val="20"/>
+                <w:szCs w:val="20"/>
+                <w:lang w:val="en-US" w:eastAsia="en-US" w:bidi="ar-SA"/>
+              </w:rPr>
+              <w:t>yes</w:t>
             </w:r>
           </w:p>
         </w:tc>
@@ -6198,16 +6267,13 @@
               <w:spacing w:lineRule="auto" w:line="240" w:before="80" w:after="80"/>
               <w:jc w:val="left"/>
               <w:rPr>
-                <w:rFonts w:ascii="Arial" w:hAnsi="Arial" w:cs="Arial"/>
-                <w:color w:val="C00000"/>
-                <w:sz w:val="20"/>
-                <w:szCs w:val="20"/>
-              </w:rPr>
-            </w:pPr>
-            <w:r>
-              <w:rPr>
-                <w:rFonts w:eastAsia="Calibri" w:cs="Arial" w:ascii="Arial" w:hAnsi="Arial"/>
-                <w:color w:val="C00000"/>
+                <w:color w:val="1E6A39"/>
+              </w:rPr>
+            </w:pPr>
+            <w:r>
+              <w:rPr>
+                <w:rFonts w:eastAsia="Calibri" w:cs="Arial" w:ascii="Arial" w:hAnsi="Arial"/>
+                <w:color w:val="1E6A39"/>
                 <w:kern w:val="0"/>
                 <w:sz w:val="20"/>
                 <w:szCs w:val="20"/>
@@ -6254,7 +6320,7 @@
         </w:tc>
         <w:tc>
           <w:tcPr>
-            <w:tcW w:w="3570" w:type="dxa"/>
+            <w:tcW w:w="3569" w:type="dxa"/>
             <w:tcBorders/>
           </w:tcPr>
           <w:p>
@@ -6312,7 +6378,7 @@
         </w:tc>
         <w:tc>
           <w:tcPr>
-            <w:tcW w:w="3932" w:type="dxa"/>
+            <w:tcW w:w="3933" w:type="dxa"/>
             <w:tcBorders/>
           </w:tcPr>
           <w:p>
@@ -6352,22 +6418,19 @@
               <w:spacing w:lineRule="auto" w:line="240" w:before="80" w:after="80"/>
               <w:jc w:val="left"/>
               <w:rPr>
-                <w:rFonts w:ascii="Arial" w:hAnsi="Arial" w:cs="Arial"/>
-                <w:color w:val="C00000"/>
-                <w:sz w:val="20"/>
-                <w:szCs w:val="20"/>
-              </w:rPr>
-            </w:pPr>
-            <w:r>
-              <w:rPr>
-                <w:rFonts w:eastAsia="Calibri" w:cs="Arial" w:ascii="Arial" w:hAnsi="Arial"/>
-                <w:color w:val="C00000"/>
-                <w:kern w:val="0"/>
-                <w:sz w:val="20"/>
-                <w:szCs w:val="20"/>
-                <w:lang w:val="en-US" w:eastAsia="en-US" w:bidi="ar-SA"/>
-              </w:rPr>
-              <w:t>&lt;yes/no&gt;</w:t>
+                <w:color w:val="55308D"/>
+              </w:rPr>
+            </w:pPr>
+            <w:r>
+              <w:rPr>
+                <w:rFonts w:eastAsia="Calibri" w:cs="Arial" w:ascii="Arial" w:hAnsi="Arial"/>
+                <w:color w:val="55308D"/>
+                <w:kern w:val="0"/>
+                <w:sz w:val="20"/>
+                <w:szCs w:val="20"/>
+                <w:lang w:val="en-US" w:eastAsia="en-US" w:bidi="ar-SA"/>
+              </w:rPr>
+              <w:t>yes</w:t>
             </w:r>
           </w:p>
         </w:tc>
@@ -6384,16 +6447,13 @@
               <w:spacing w:lineRule="auto" w:line="240" w:before="80" w:after="80"/>
               <w:jc w:val="left"/>
               <w:rPr>
-                <w:rFonts w:ascii="Arial" w:hAnsi="Arial" w:cs="Arial"/>
-                <w:color w:val="C00000"/>
-                <w:sz w:val="20"/>
-                <w:szCs w:val="20"/>
-              </w:rPr>
-            </w:pPr>
-            <w:r>
-              <w:rPr>
-                <w:rFonts w:eastAsia="Calibri" w:cs="Arial" w:ascii="Arial" w:hAnsi="Arial"/>
-                <w:color w:val="C00000"/>
+                <w:color w:val="1E6A39"/>
+              </w:rPr>
+            </w:pPr>
+            <w:r>
+              <w:rPr>
+                <w:rFonts w:eastAsia="Calibri" w:cs="Arial" w:ascii="Arial" w:hAnsi="Arial"/>
+                <w:color w:val="1E6A39"/>
                 <w:kern w:val="0"/>
                 <w:sz w:val="20"/>
                 <w:szCs w:val="20"/>
@@ -6440,7 +6500,7 @@
         </w:tc>
         <w:tc>
           <w:tcPr>
-            <w:tcW w:w="3570" w:type="dxa"/>
+            <w:tcW w:w="3569" w:type="dxa"/>
             <w:tcBorders/>
           </w:tcPr>
           <w:p>
@@ -6472,7 +6532,7 @@
         </w:tc>
         <w:tc>
           <w:tcPr>
-            <w:tcW w:w="3932" w:type="dxa"/>
+            <w:tcW w:w="3933" w:type="dxa"/>
             <w:tcBorders/>
           </w:tcPr>
           <w:p>
@@ -6515,22 +6575,19 @@
               <w:spacing w:lineRule="auto" w:line="240" w:before="80" w:after="80"/>
               <w:jc w:val="left"/>
               <w:rPr>
-                <w:rFonts w:ascii="Arial" w:hAnsi="Arial" w:cs="Arial"/>
-                <w:color w:val="C00000"/>
-                <w:sz w:val="20"/>
-                <w:szCs w:val="20"/>
-              </w:rPr>
-            </w:pPr>
-            <w:r>
-              <w:rPr>
-                <w:rFonts w:eastAsia="Calibri" w:cs="Arial" w:ascii="Arial" w:hAnsi="Arial"/>
-                <w:color w:val="C00000"/>
-                <w:kern w:val="0"/>
-                <w:sz w:val="20"/>
-                <w:szCs w:val="20"/>
-                <w:lang w:val="en-US" w:eastAsia="en-US" w:bidi="ar-SA"/>
-              </w:rPr>
-              <w:t>&lt;yes/no&gt;</w:t>
+                <w:color w:val="55308D"/>
+              </w:rPr>
+            </w:pPr>
+            <w:r>
+              <w:rPr>
+                <w:rFonts w:eastAsia="Calibri" w:cs="Arial" w:ascii="Arial" w:hAnsi="Arial"/>
+                <w:color w:val="55308D"/>
+                <w:kern w:val="0"/>
+                <w:sz w:val="20"/>
+                <w:szCs w:val="20"/>
+                <w:lang w:val="en-US" w:eastAsia="en-US" w:bidi="ar-SA"/>
+              </w:rPr>
+              <w:t>yes</w:t>
             </w:r>
           </w:p>
         </w:tc>
@@ -6547,16 +6604,13 @@
               <w:spacing w:lineRule="auto" w:line="240" w:before="80" w:after="80"/>
               <w:jc w:val="left"/>
               <w:rPr>
-                <w:rFonts w:ascii="Arial" w:hAnsi="Arial" w:cs="Arial"/>
-                <w:color w:val="C00000"/>
-                <w:sz w:val="20"/>
-                <w:szCs w:val="20"/>
-              </w:rPr>
-            </w:pPr>
-            <w:r>
-              <w:rPr>
-                <w:rFonts w:eastAsia="Calibri" w:cs="Arial" w:ascii="Arial" w:hAnsi="Arial"/>
-                <w:color w:val="C00000"/>
+                <w:color w:val="1E6A39"/>
+              </w:rPr>
+            </w:pPr>
+            <w:r>
+              <w:rPr>
+                <w:rFonts w:eastAsia="Calibri" w:cs="Arial" w:ascii="Arial" w:hAnsi="Arial"/>
+                <w:color w:val="1E6A39"/>
                 <w:kern w:val="0"/>
                 <w:sz w:val="20"/>
                 <w:szCs w:val="20"/>
@@ -6605,7 +6659,7 @@
         </w:tc>
         <w:tc>
           <w:tcPr>
-            <w:tcW w:w="3570" w:type="dxa"/>
+            <w:tcW w:w="3569" w:type="dxa"/>
             <w:tcBorders>
               <w:top w:val="nil"/>
             </w:tcBorders>
@@ -6639,7 +6693,7 @@
         </w:tc>
         <w:tc>
           <w:tcPr>
-            <w:tcW w:w="3932" w:type="dxa"/>
+            <w:tcW w:w="3933" w:type="dxa"/>
             <w:tcBorders>
               <w:top w:val="nil"/>
             </w:tcBorders>
@@ -6686,19 +6740,19 @@
               <w:spacing w:lineRule="auto" w:line="240" w:before="80" w:after="80"/>
               <w:jc w:val="left"/>
               <w:rPr>
-                <w:rFonts w:ascii="Arial" w:hAnsi="Arial" w:cs="Arial"/>
-                <w:color w:val="C00000"/>
-                <w:sz w:val="20"/>
-                <w:szCs w:val="20"/>
-              </w:rPr>
-            </w:pPr>
-            <w:r>
-              <w:rPr>
-                <w:rFonts w:cs="Arial" w:ascii="Arial" w:hAnsi="Arial"/>
-                <w:color w:val="C00000"/>
-                <w:sz w:val="20"/>
-                <w:szCs w:val="20"/>
-              </w:rPr>
+                <w:color w:val="55308D"/>
+              </w:rPr>
+            </w:pPr>
+            <w:r>
+              <w:rPr>
+                <w:rFonts w:eastAsia="Calibri" w:cs="Arial" w:ascii="Arial" w:hAnsi="Arial"/>
+                <w:color w:val="55308D"/>
+                <w:kern w:val="0"/>
+                <w:sz w:val="20"/>
+                <w:szCs w:val="20"/>
+                <w:lang w:val="en-US" w:eastAsia="en-US" w:bidi="ar-SA"/>
+              </w:rPr>
+              <w:t>yes</w:t>
             </w:r>
           </w:p>
         </w:tc>
@@ -6717,19 +6771,19 @@
               <w:spacing w:lineRule="auto" w:line="240" w:before="80" w:after="80"/>
               <w:jc w:val="left"/>
               <w:rPr>
-                <w:rFonts w:ascii="Arial" w:hAnsi="Arial" w:cs="Arial"/>
-                <w:color w:val="C00000"/>
-                <w:sz w:val="20"/>
-                <w:szCs w:val="20"/>
-              </w:rPr>
-            </w:pPr>
-            <w:r>
-              <w:rPr>
-                <w:rFonts w:cs="Arial" w:ascii="Arial" w:hAnsi="Arial"/>
-                <w:color w:val="C00000"/>
-                <w:sz w:val="20"/>
-                <w:szCs w:val="20"/>
-              </w:rPr>
+                <w:color w:val="1E6A39"/>
+              </w:rPr>
+            </w:pPr>
+            <w:r>
+              <w:rPr>
+                <w:rFonts w:eastAsia="Calibri" w:cs="Arial" w:ascii="Arial" w:hAnsi="Arial"/>
+                <w:color w:val="1E6A39"/>
+                <w:kern w:val="0"/>
+                <w:sz w:val="20"/>
+                <w:szCs w:val="20"/>
+                <w:lang w:val="en-US" w:eastAsia="en-US" w:bidi="ar-SA"/>
+              </w:rPr>
+              <w:t>&lt;yes/no&gt;</w:t>
             </w:r>
           </w:p>
         </w:tc>
@@ -6786,16 +6840,13 @@
               <w:spacing w:lineRule="auto" w:line="240" w:before="80" w:after="80"/>
               <w:jc w:val="left"/>
               <w:rPr>
-                <w:rFonts w:ascii="Arial" w:hAnsi="Arial" w:cs="Arial"/>
-                <w:color w:val="C00000"/>
-                <w:sz w:val="20"/>
-                <w:szCs w:val="20"/>
-              </w:rPr>
-            </w:pPr>
-            <w:r>
-              <w:rPr>
-                <w:rFonts w:eastAsia="Calibri" w:cs="Arial" w:ascii="Arial" w:hAnsi="Arial"/>
-                <w:color w:val="C00000"/>
+                <w:color w:val="1E6A39"/>
+              </w:rPr>
+            </w:pPr>
+            <w:r>
+              <w:rPr>
+                <w:rFonts w:eastAsia="Calibri" w:cs="Arial" w:ascii="Arial" w:hAnsi="Arial"/>
+                <w:color w:val="1E6A39"/>
                 <w:kern w:val="0"/>
                 <w:sz w:val="20"/>
                 <w:szCs w:val="20"/>
@@ -6914,7 +6965,7 @@
         <w:rFonts w:cs="Arial" w:ascii="Arial" w:hAnsi="Arial"/>
         <w:color w:themeColor="accent1" w:val="4472C4"/>
       </w:rPr>
-      <w:t>6</w:t>
+      <w:t>3</w:t>
     </w:r>
     <w:r>
       <w:rPr>
@@ -7056,7 +7107,7 @@
         <w:rFonts w:cs="Arial" w:ascii="Arial" w:hAnsi="Arial"/>
         <w:color w:themeColor="accent1" w:val="4472C4"/>
       </w:rPr>
-      <w:t>6</w:t>
+      <w:t>3</w:t>
     </w:r>
     <w:r>
       <w:rPr>

</xml_diff>